<commit_message>
Add QR transfer links to GSN setup pack
</commit_message>
<xml_diff>
--- a/docs/gsn-user-guide/GSN_SELF_SERVICE_USER_GUIDE.docx
+++ b/docs/gsn-user-guide/GSN_SELF_SERVICE_USER_GUIDE.docx
@@ -1494,6 +1494,107 @@
     <w:p>
       <w:r>
         <w:t>GSN is an evidence and action system. It helps people set up real records, take structured actions, and show public-safe evidence. It does not secretly decide who is trustworthy. The final decision always belongs to the buyer, community, lender, sponsor, verifier, or organisation receiving the evidence.</w:t>
+      </w:r>
+    </w:p>
+    <w:p>
+      <w:r>
+        <w:br w:type="page"/>
+      </w:r>
+    </w:p>
+    <w:p>
+      <w:pPr>
+        <w:jc w:val="center"/>
+      </w:pPr>
+      <w:r>
+        <w:rPr>
+          <w:b/>
+          <w:color w:val="0B2545"/>
+          <w:sz w:val="32"/>
+        </w:rPr>
+        <w:t>Scan to download this GSN article</w:t>
+      </w:r>
+    </w:p>
+    <w:p>
+      <w:pPr>
+        <w:jc w:val="center"/>
+      </w:pPr>
+      <w:r>
+        <w:rPr>
+          <w:b/>
+        </w:rPr>
+        <w:t>What to Set Up, What It Does, and How to Use It</w:t>
+      </w:r>
+    </w:p>
+    <w:p>
+      <w:pPr>
+        <w:jc w:val="center"/>
+      </w:pPr>
+      <w:r>
+        <w:drawing>
+          <wp:inline xmlns:a="http://schemas.openxmlformats.org/drawingml/2006/main" xmlns:pic="http://schemas.openxmlformats.org/drawingml/2006/picture">
+            <wp:extent cx="1645920" cy="1645920"/>
+            <wp:docPr id="1" name="Picture 1"/>
+            <wp:cNvGraphicFramePr>
+              <a:graphicFrameLocks noChangeAspect="1"/>
+            </wp:cNvGraphicFramePr>
+            <a:graphic>
+              <a:graphicData uri="http://schemas.openxmlformats.org/drawingml/2006/picture">
+                <pic:pic>
+                  <pic:nvPicPr>
+                    <pic:cNvPr id="0" name="setup-guide-pdf.png"/>
+                    <pic:cNvPicPr/>
+                  </pic:nvPicPr>
+                  <pic:blipFill>
+                    <a:blip r:embed="rId11"/>
+                    <a:stretch>
+                      <a:fillRect/>
+                    </a:stretch>
+                  </pic:blipFill>
+                  <pic:spPr>
+                    <a:xfrm>
+                      <a:off x="0" y="0"/>
+                      <a:ext cx="1645920" cy="1645920"/>
+                    </a:xfrm>
+                    <a:prstGeom prst="rect"/>
+                  </pic:spPr>
+                </pic:pic>
+              </a:graphicData>
+            </a:graphic>
+          </wp:inline>
+        </w:drawing>
+      </w:r>
+    </w:p>
+    <w:p>
+      <w:pPr>
+        <w:jc w:val="center"/>
+      </w:pPr>
+      <w:r>
+        <w:t>For: Leaders, admins and members</w:t>
+      </w:r>
+    </w:p>
+    <w:p>
+      <w:pPr>
+        <w:jc w:val="center"/>
+      </w:pPr>
+      <w:r>
+        <w:t>https://raw.githubusercontent.com/chumanwafor216-svg/gmfn-mvp/main/docs/gsn-user-</w:t>
+      </w:r>
+      <w:r>
+        <w:br/>
+      </w:r>
+      <w:r>
+        <w:t>guide/GSN_SELF_SERVICE_USER_GUIDE.pdf</w:t>
+      </w:r>
+      <w:r>
+        <w:br/>
+      </w:r>
+    </w:p>
+    <w:p>
+      <w:pPr>
+        <w:jc w:val="center"/>
+      </w:pPr>
+      <w:r>
+        <w:t>QR access depends on the file being publicly reachable or shared through an approved public mirror.</w:t>
       </w:r>
     </w:p>
     <w:sectPr>

</xml_diff>